<commit_message>
Add author details, license and citation
</commit_message>
<xml_diff>
--- a/paper/drift_or_defect.docx
+++ b/paper/drift_or_defect.docx
@@ -22,7 +22,11 @@
         <w:rPr>
           <w:i/>
         </w:rPr>
-        <w:t>[Author names and affiliations withheld]</w:t>
+        <w:t>Ankitha Vuyyala</w:t>
+        <w:br/>
+        <w:t>Independent Researcher, Louisville, Kentucky, USA</w:t>
+        <w:br/>
+        <w:t>ankithavuyyala08@gmail.com · ORCID: https://orcid.org/0009-0004-1916-8070</w:t>
       </w:r>
     </w:p>
     <w:p>
@@ -33,7 +37,7 @@
         <w:rPr>
           <w:sz w:val="17"/>
         </w:rPr>
-        <w:t>Preprint. Code, benchmark, raw records and replay scripts: [repository link to be added]</w:t>
+        <w:t>October 2026. Code, benchmark, raw records and replay scripts: https://github.com/ankitha-vuyyala/drift-or-defect</w:t>
       </w:r>
     </w:p>
     <w:p>
@@ -7724,7 +7728,7 @@
         <w:t>Funding.</w:t>
       </w:r>
       <w:r>
-        <w:t xml:space="preserve"> [To be completed by the authors.]</w:t>
+        <w:t xml:space="preserve"> This research was self-funded by the author and received no external funding. The author paid all model API costs (US$ 12.49 in total).</w:t>
       </w:r>
     </w:p>
     <w:p>
@@ -7738,7 +7742,7 @@
         <w:t>Competing interests.</w:t>
       </w:r>
       <w:r>
-        <w:t xml:space="preserve"> [To be completed by the authors.]</w:t>
+        <w:t xml:space="preserve"> The author declares no competing interests.</w:t>
       </w:r>
     </w:p>
     <w:p>
@@ -7749,10 +7753,10 @@
         <w:rPr>
           <w:b/>
         </w:rPr>
-        <w:t>Use of AI tools.</w:t>
-      </w:r>
-      <w:r>
-        <w:t xml:space="preserve"> [To be completed by the authors.]</w:t>
+        <w:t>Author contributions.</w:t>
+      </w:r>
+      <w:r>
+        <w:t xml:space="preserve"> Ankitha Vuyyala: conceptualization, methodology, software, investigation, validation, formal analysis, visualization, and writing (original draft, review and editing). The author reviewed and approved the final manuscript and accepts responsibility for its content.</w:t>
       </w:r>
     </w:p>
     <w:p>
@@ -7763,10 +7767,38 @@
         <w:rPr>
           <w:b/>
         </w:rPr>
+        <w:t>Use of AI tools.</w:t>
+      </w:r>
+      <w:r>
+        <w:t xml:space="preserve"> [To be completed by the author.]</w:t>
+      </w:r>
+    </w:p>
+    <w:p>
+      <w:pPr>
+        <w:jc w:val="both"/>
+      </w:pPr>
+      <w:r>
+        <w:rPr>
+          <w:b/>
+        </w:rPr>
         <w:t>Data and code availability.</w:t>
       </w:r>
       <w:r>
-        <w:t xml:space="preserve"> All data are public: ACS PUMS (U.S. Census Bureau), NYC TLC trip records, the HuffPost News Category dataset, Divvy and Capital Bikeshare trip data, HMDA records (CFPB and FFIEC), BTS on-time performance data, NHTSA FARS, NOAA NCEI Storm Events, City of Chicago Traffic Crashes, and HM Land Registry Price Paid Data (contains HM Land Registry data © Crown copyright and database right, licensed under the Open Government Licence v3.0). Code, benchmark definitions, raw case records and a replay script that needs no API keys will be released at [repository link].</w:t>
+        <w:t xml:space="preserve"> The DoD implementation (all four versions), the baselines, the eleven executable pipelines with their defect catalogs and records of published source changes, the frozen study protocols and analysis plans, the raw case records of all four rounds and of the development runs, and the analysis and paper-build scripts are publicly available at https://github.com/ankitha-vuyyala/drift-or-defect. The artifacts corresponding to this manuscript are archived in release v1.0 at https://github.com/ankitha-vuyyala/drift-or-defect/releases/tag/v1.0. The repository includes the response cache of the 17,078 paid model calls, whose token usage and cost are recorded per model in runs/cost_ledger.json. The case records regenerate every reported number, table and figure (paper/evidence_index.md maps each number to the file it was computed from), and the response cache replays every model decision without an API key. The source data are public and are not redistributed; the download scripts fetch them from their providers and check them against SHA-256 manifests: ACS PUMS (U.S. Census Bureau), NYC TLC trip records, the HuffPost News Category dataset, Divvy and Capital Bikeshare trip data, HMDA records (CFPB and FFIEC), BTS on-time performance data, NHTSA FARS, NOAA NCEI Storm Events, City of Chicago Traffic Crashes, and HM Land Registry Price Paid Data (contains HM Land Registry data © Crown copyright and database right, licensed under the Open Government Licence v3.0). Third-party data remain subject to their providers' licenses and attribution requirements.</w:t>
+      </w:r>
+    </w:p>
+    <w:p>
+      <w:pPr>
+        <w:jc w:val="both"/>
+      </w:pPr>
+      <w:r>
+        <w:rPr>
+          <w:b/>
+        </w:rPr>
+        <w:t>Corresponding author.</w:t>
+      </w:r>
+      <w:r>
+        <w:t xml:space="preserve"> Ankitha Vuyyala. Email: ankithavuyyala08@gmail.com</w:t>
       </w:r>
     </w:p>
     <w:p>

</xml_diff>